<commit_message>
docs: añadido texto e imágenes
</commit_message>
<xml_diff>
--- a/entregas/jose.arias/AEC-GIT/README.docx
+++ b/entregas/jose.arias/AEC-GIT/README.docx
@@ -59,7 +59,7 @@
           <wp:inline distB="114300" distT="114300" distL="114300" distR="114300">
             <wp:extent cx="5731200" cy="2946400"/>
             <wp:effectExtent b="0" l="0" r="0" t="0"/>
-            <wp:docPr id="2" name="image1.png"/>
+            <wp:docPr id="7" name="image1.png"/>
             <a:graphic>
               <a:graphicData uri="http://schemas.openxmlformats.org/drawingml/2006/picture">
                 <pic:pic>
@@ -94,12 +94,12 @@
           <wp:inline distB="114300" distT="114300" distL="114300" distR="114300">
             <wp:extent cx="5731200" cy="2070100"/>
             <wp:effectExtent b="0" l="0" r="0" t="0"/>
-            <wp:docPr id="1" name="image2.png"/>
+            <wp:docPr id="5" name="image5.png"/>
             <a:graphic>
               <a:graphicData uri="http://schemas.openxmlformats.org/drawingml/2006/picture">
                 <pic:pic>
                   <pic:nvPicPr>
-                    <pic:cNvPr id="0" name="image2.png"/>
+                    <pic:cNvPr id="0" name="image5.png"/>
                     <pic:cNvPicPr preferRelativeResize="0"/>
                   </pic:nvPicPr>
                   <pic:blipFill>
@@ -169,9 +169,277 @@
         <w:rPr/>
       </w:pPr>
       <w:r>
-        <w:rPr>
-          <w:rtl w:val="0"/>
-        </w:rPr>
+        <w:rPr/>
+        <w:drawing>
+          <wp:inline distB="114300" distT="114300" distL="114300" distR="114300">
+            <wp:extent cx="5700713" cy="3686175"/>
+            <wp:effectExtent b="0" l="0" r="0" t="0"/>
+            <wp:docPr id="3" name="image4.png"/>
+            <a:graphic>
+              <a:graphicData uri="http://schemas.openxmlformats.org/drawingml/2006/picture">
+                <pic:pic>
+                  <pic:nvPicPr>
+                    <pic:cNvPr id="0" name="image4.png"/>
+                    <pic:cNvPicPr preferRelativeResize="0"/>
+                  </pic:nvPicPr>
+                  <pic:blipFill>
+                    <a:blip r:embed="rId8"/>
+                    <a:srcRect b="0" l="0" r="0" t="0"/>
+                    <a:stretch>
+                      <a:fillRect/>
+                    </a:stretch>
+                  </pic:blipFill>
+                  <pic:spPr>
+                    <a:xfrm>
+                      <a:off x="0" y="0"/>
+                      <a:ext cx="5700713" cy="3686175"/>
+                    </a:xfrm>
+                    <a:prstGeom prst="rect"/>
+                    <a:ln/>
+                  </pic:spPr>
+                </pic:pic>
+              </a:graphicData>
+            </a:graphic>
+          </wp:inline>
+        </w:drawing>
+      </w:r>
+      <w:r>
+        <w:rPr/>
+        <w:drawing>
+          <wp:inline distB="114300" distT="114300" distL="114300" distR="114300">
+            <wp:extent cx="5731200" cy="1930400"/>
+            <wp:effectExtent b="0" l="0" r="0" t="0"/>
+            <wp:docPr id="8" name="image2.png"/>
+            <a:graphic>
+              <a:graphicData uri="http://schemas.openxmlformats.org/drawingml/2006/picture">
+                <pic:pic>
+                  <pic:nvPicPr>
+                    <pic:cNvPr id="0" name="image2.png"/>
+                    <pic:cNvPicPr preferRelativeResize="0"/>
+                  </pic:nvPicPr>
+                  <pic:blipFill>
+                    <a:blip r:embed="rId9"/>
+                    <a:srcRect b="0" l="0" r="0" t="0"/>
+                    <a:stretch>
+                      <a:fillRect/>
+                    </a:stretch>
+                  </pic:blipFill>
+                  <pic:spPr>
+                    <a:xfrm>
+                      <a:off x="0" y="0"/>
+                      <a:ext cx="5731200" cy="1930400"/>
+                    </a:xfrm>
+                    <a:prstGeom prst="rect"/>
+                    <a:ln/>
+                  </pic:spPr>
+                </pic:pic>
+              </a:graphicData>
+            </a:graphic>
+          </wp:inline>
+        </w:drawing>
+      </w:r>
+      <w:r>
+        <w:rPr/>
+        <w:drawing>
+          <wp:inline distB="114300" distT="114300" distL="114300" distR="114300">
+            <wp:extent cx="5731200" cy="2133600"/>
+            <wp:effectExtent b="0" l="0" r="0" t="0"/>
+            <wp:docPr id="4" name="image8.png"/>
+            <a:graphic>
+              <a:graphicData uri="http://schemas.openxmlformats.org/drawingml/2006/picture">
+                <pic:pic>
+                  <pic:nvPicPr>
+                    <pic:cNvPr id="0" name="image8.png"/>
+                    <pic:cNvPicPr preferRelativeResize="0"/>
+                  </pic:nvPicPr>
+                  <pic:blipFill>
+                    <a:blip r:embed="rId10"/>
+                    <a:srcRect b="0" l="0" r="0" t="0"/>
+                    <a:stretch>
+                      <a:fillRect/>
+                    </a:stretch>
+                  </pic:blipFill>
+                  <pic:spPr>
+                    <a:xfrm>
+                      <a:off x="0" y="0"/>
+                      <a:ext cx="5731200" cy="2133600"/>
+                    </a:xfrm>
+                    <a:prstGeom prst="rect"/>
+                    <a:ln/>
+                  </pic:spPr>
+                </pic:pic>
+              </a:graphicData>
+            </a:graphic>
+          </wp:inline>
+        </w:drawing>
+      </w:r>
+      <w:r>
+        <w:rPr>
+          <w:rtl w:val="0"/>
+        </w:rPr>
+      </w:r>
+    </w:p>
+    <w:p>
+      <w:pPr>
+        <w:jc w:val="both"/>
+        <w:rPr/>
+      </w:pPr>
+      <w:r>
+        <w:rPr>
+          <w:rtl w:val="0"/>
+        </w:rPr>
+      </w:r>
+    </w:p>
+    <w:p>
+      <w:pPr>
+        <w:jc w:val="both"/>
+        <w:rPr/>
+      </w:pPr>
+      <w:r>
+        <w:rPr>
+          <w:rtl w:val="0"/>
+        </w:rPr>
+        <w:t xml:space="preserve">Se creó el archivo README.txt</w:t>
+      </w:r>
+    </w:p>
+    <w:p>
+      <w:pPr>
+        <w:jc w:val="both"/>
+        <w:rPr/>
+      </w:pPr>
+      <w:r>
+        <w:rPr/>
+        <w:drawing>
+          <wp:inline distB="114300" distT="114300" distL="114300" distR="114300">
+            <wp:extent cx="5731200" cy="4432300"/>
+            <wp:effectExtent b="0" l="0" r="0" t="0"/>
+            <wp:docPr id="2" name="image3.png"/>
+            <a:graphic>
+              <a:graphicData uri="http://schemas.openxmlformats.org/drawingml/2006/picture">
+                <pic:pic>
+                  <pic:nvPicPr>
+                    <pic:cNvPr id="0" name="image3.png"/>
+                    <pic:cNvPicPr preferRelativeResize="0"/>
+                  </pic:nvPicPr>
+                  <pic:blipFill>
+                    <a:blip r:embed="rId11"/>
+                    <a:srcRect b="0" l="0" r="0" t="0"/>
+                    <a:stretch>
+                      <a:fillRect/>
+                    </a:stretch>
+                  </pic:blipFill>
+                  <pic:spPr>
+                    <a:xfrm>
+                      <a:off x="0" y="0"/>
+                      <a:ext cx="5731200" cy="4432300"/>
+                    </a:xfrm>
+                    <a:prstGeom prst="rect"/>
+                    <a:ln/>
+                  </pic:spPr>
+                </pic:pic>
+              </a:graphicData>
+            </a:graphic>
+          </wp:inline>
+        </w:drawing>
+      </w:r>
+      <w:r>
+        <w:rPr/>
+        <w:drawing>
+          <wp:inline distB="114300" distT="114300" distL="114300" distR="114300">
+            <wp:extent cx="5731200" cy="3225800"/>
+            <wp:effectExtent b="0" l="0" r="0" t="0"/>
+            <wp:docPr id="1" name="image7.png"/>
+            <a:graphic>
+              <a:graphicData uri="http://schemas.openxmlformats.org/drawingml/2006/picture">
+                <pic:pic>
+                  <pic:nvPicPr>
+                    <pic:cNvPr id="0" name="image7.png"/>
+                    <pic:cNvPicPr preferRelativeResize="0"/>
+                  </pic:nvPicPr>
+                  <pic:blipFill>
+                    <a:blip r:embed="rId12"/>
+                    <a:srcRect b="0" l="0" r="0" t="0"/>
+                    <a:stretch>
+                      <a:fillRect/>
+                    </a:stretch>
+                  </pic:blipFill>
+                  <pic:spPr>
+                    <a:xfrm>
+                      <a:off x="0" y="0"/>
+                      <a:ext cx="5731200" cy="3225800"/>
+                    </a:xfrm>
+                    <a:prstGeom prst="rect"/>
+                    <a:ln/>
+                  </pic:spPr>
+                </pic:pic>
+              </a:graphicData>
+            </a:graphic>
+          </wp:inline>
+        </w:drawing>
+      </w:r>
+      <w:r>
+        <w:rPr/>
+        <w:drawing>
+          <wp:inline distB="114300" distT="114300" distL="114300" distR="114300">
+            <wp:extent cx="5731200" cy="2349500"/>
+            <wp:effectExtent b="0" l="0" r="0" t="0"/>
+            <wp:docPr id="6" name="image6.png"/>
+            <a:graphic>
+              <a:graphicData uri="http://schemas.openxmlformats.org/drawingml/2006/picture">
+                <pic:pic>
+                  <pic:nvPicPr>
+                    <pic:cNvPr id="0" name="image6.png"/>
+                    <pic:cNvPicPr preferRelativeResize="0"/>
+                  </pic:nvPicPr>
+                  <pic:blipFill>
+                    <a:blip r:embed="rId13"/>
+                    <a:srcRect b="0" l="0" r="0" t="0"/>
+                    <a:stretch>
+                      <a:fillRect/>
+                    </a:stretch>
+                  </pic:blipFill>
+                  <pic:spPr>
+                    <a:xfrm>
+                      <a:off x="0" y="0"/>
+                      <a:ext cx="5731200" cy="2349500"/>
+                    </a:xfrm>
+                    <a:prstGeom prst="rect"/>
+                    <a:ln/>
+                  </pic:spPr>
+                </pic:pic>
+              </a:graphicData>
+            </a:graphic>
+          </wp:inline>
+        </w:drawing>
+      </w:r>
+      <w:r>
+        <w:rPr>
+          <w:rtl w:val="0"/>
+        </w:rPr>
+      </w:r>
+    </w:p>
+    <w:p>
+      <w:pPr>
+        <w:jc w:val="both"/>
+        <w:rPr/>
+      </w:pPr>
+      <w:r>
+        <w:rPr>
+          <w:rtl w:val="0"/>
+        </w:rPr>
+        <w:t xml:space="preserve">Se hizo el primer </w:t>
+      </w:r>
+      <w:r>
+        <w:rPr>
+          <w:rtl w:val="0"/>
+        </w:rPr>
+        <w:t xml:space="preserve">commit</w:t>
+      </w:r>
+      <w:r>
+        <w:rPr>
+          <w:rtl w:val="0"/>
+        </w:rPr>
+        <w:t xml:space="preserve"> del README.txt y se hizo el cambio de branch de la main a docs/modificaciones. </w:t>
       </w:r>
     </w:p>
     <w:sectPr>

</xml_diff>